<commit_message>
template de avisos de contraste actualizado
</commit_message>
<xml_diff>
--- a/public/templates/template_avisos.docx
+++ b/public/templates/template_avisos.docx
@@ -295,7 +295,39 @@
           <w:b/>
           <w:sz w:val="22"/>
         </w:rPr>
-        <w:t>ORDEN DE TRABAJO - AVISOS DE VERIFICACIÓN DEL SISTEMA DE MEDICIÓN POR P-227 - {item}</w:t>
+        <w:t xml:space="preserve">ORDEN DE TRABAJO </w:t>
+      </w:r>
+      <w:r>
+        <w:rPr>
+          <w:rFonts w:ascii="Arial" w:eastAsia="Arial" w:hAnsi="Arial" w:cs="Arial"/>
+          <w:b/>
+          <w:sz w:val="22"/>
+        </w:rPr>
+        <w:t>–</w:t>
+      </w:r>
+      <w:r>
+        <w:rPr>
+          <w:rFonts w:ascii="Arial" w:eastAsia="Arial" w:hAnsi="Arial" w:cs="Arial"/>
+          <w:b/>
+          <w:sz w:val="22"/>
+        </w:rPr>
+        <w:t xml:space="preserve"> </w:t>
+      </w:r>
+      <w:r>
+        <w:rPr>
+          <w:rFonts w:ascii="Arial" w:eastAsia="Arial" w:hAnsi="Arial" w:cs="Arial"/>
+          <w:b/>
+          <w:sz w:val="22"/>
+        </w:rPr>
+        <w:t xml:space="preserve">CAMBIOS Y </w:t>
+      </w:r>
+      <w:r>
+        <w:rPr>
+          <w:rFonts w:ascii="Arial" w:eastAsia="Arial" w:hAnsi="Arial" w:cs="Arial"/>
+          <w:b/>
+          <w:sz w:val="22"/>
+        </w:rPr>
+        <w:t>AVISOS DE VERIFICACIÓN DEL SISTEMA DE MEDICIÓN POR P-227 - {item}</w:t>
       </w:r>
     </w:p>
     <w:tbl>
@@ -1087,12 +1119,17 @@
             <w:pPr>
               <w:spacing w:after="0" w:line="259" w:lineRule="auto"/>
               <w:ind w:left="0" w:right="0" w:firstLine="0"/>
-            </w:pPr>
-            <w:r>
               <w:rPr>
                 <w:b/>
-              </w:rPr>
-              <w:t>{ac}</w:t>
+                <w:bCs/>
+              </w:rPr>
+            </w:pPr>
+            <w:r>
+              <w:rPr>
+                <w:b/>
+                <w:bCs/>
+              </w:rPr>
+              <w:t>AVISOS DEVERIFICACION POSTERIOR DE MEDIDORES Y CAMBIO DE MEDIDORES DEFECTUOSOS</w:t>
             </w:r>
           </w:p>
         </w:tc>

</xml_diff>